<commit_message>
Refine chapter 7 MPC braking and verify pressure limit
</commit_message>
<xml_diff>
--- a/chapter7_latest/deliverables/第七章_MPC约束控制实验报告.docx
+++ b/chapter7_latest/deliverables/第七章_MPC约束控制实验报告.docx
@@ -63,7 +63,7 @@
     </w:p>
     <w:p>
       <w:r>
-        <w:t>两组 MPC 共用 Q=diag([100,50,0,0,0])，分别惩罚位置 mm 与速度 m/s 的误差；运动期电压增量权重 W=0.01。当 |位置误差|≤0.5 mm 且 |速度|≤0.1 m/s 时，两组共同切换到 W=0.1，抑制末端指令抖动。这是基于当前状态的优化代价调度，未平滑计算后的电压或轨迹；CSV 的 move_weight、settling_cost_active 与逐步日志保存实际模式。</w:t>
+        <w:t>两组 MPC 共用 Q=diag([100,20,0,0,0])，分别惩罚位置 mm 与速度 m/s 的误差；运动期电压增量权重 W=0.01。当 |位置误差|≤0.5 mm 且 |速度|≤0.1 m/s 时，两组共同切换到 W=0.1，抑制末端指令抖动。这是基于当前状态的优化代价调度，未平滑计算后的电压或轨迹；CSV 的 move_weight、settling_cost_active 与逐步日志保存实际模式。</w:t>
       </w:r>
     </w:p>
     <w:p>
@@ -212,7 +212,7 @@
           </w:tcPr>
           <w:p>
             <w:r>
-              <w:t>50.4688</w:t>
+              <w:t>50.4813</w:t>
             </w:r>
           </w:p>
         </w:tc>
@@ -222,7 +222,7 @@
           </w:tcPr>
           <w:p>
             <w:r>
-              <w:t>50.7786</w:t>
+              <w:t>50.3458</w:t>
             </w:r>
           </w:p>
         </w:tc>
@@ -254,7 +254,7 @@
           </w:tcPr>
           <w:p>
             <w:r>
-              <w:t>0.938</w:t>
+              <w:t>0.963</w:t>
             </w:r>
           </w:p>
         </w:tc>
@@ -264,7 +264,7 @@
           </w:tcPr>
           <w:p>
             <w:r>
-              <w:t>1.557</w:t>
+              <w:t>0.692</w:t>
             </w:r>
           </w:p>
         </w:tc>
@@ -296,7 +296,7 @@
           </w:tcPr>
           <w:p>
             <w:r>
-              <w:t>0.050</w:t>
+              <w:t>0.051</w:t>
             </w:r>
           </w:p>
         </w:tc>
@@ -338,7 +338,7 @@
           </w:tcPr>
           <w:p>
             <w:r>
-              <w:t>0.056715</w:t>
+              <w:t>0.056702</w:t>
             </w:r>
           </w:p>
         </w:tc>
@@ -348,7 +348,7 @@
           </w:tcPr>
           <w:p>
             <w:r>
-              <w:t>0.056729</w:t>
+              <w:t>0.057342</w:t>
             </w:r>
           </w:p>
         </w:tc>
@@ -380,7 +380,7 @@
           </w:tcPr>
           <w:p>
             <w:r>
-              <w:t>-0.0164</w:t>
+              <w:t>-0.0153</w:t>
             </w:r>
           </w:p>
         </w:tc>
@@ -390,7 +390,7 @@
           </w:tcPr>
           <w:p>
             <w:r>
-              <w:t>-0.0189</w:t>
+              <w:t>-0.0172</w:t>
             </w:r>
           </w:p>
         </w:tc>
@@ -422,7 +422,7 @@
           </w:tcPr>
           <w:p>
             <w:r>
-              <w:t>29.77188</w:t>
+              <w:t>29.79575</w:t>
             </w:r>
           </w:p>
         </w:tc>
@@ -432,7 +432,7 @@
           </w:tcPr>
           <w:p>
             <w:r>
-              <w:t>20.59177</w:t>
+              <w:t>20.63844</w:t>
             </w:r>
           </w:p>
         </w:tc>
@@ -464,7 +464,7 @@
           </w:tcPr>
           <w:p>
             <w:r>
-              <w:t>8.77188</w:t>
+              <w:t>8.79575</w:t>
             </w:r>
           </w:p>
         </w:tc>
@@ -506,7 +506,7 @@
           </w:tcPr>
           <w:p>
             <w:r>
-              <w:t>15.20615</w:t>
+              <w:t>14.95371</w:t>
             </w:r>
           </w:p>
         </w:tc>
@@ -674,7 +674,7 @@
           </w:tcPr>
           <w:p>
             <w:r>
-              <w:t>0.0164</w:t>
+              <w:t>0.0153</w:t>
             </w:r>
           </w:p>
         </w:tc>
@@ -684,7 +684,7 @@
           </w:tcPr>
           <w:p>
             <w:r>
-              <w:t>0.0189</w:t>
+              <w:t>0.0172</w:t>
             </w:r>
           </w:p>
         </w:tc>
@@ -716,7 +716,7 @@
           </w:tcPr>
           <w:p>
             <w:r>
-              <w:t>0.2141</w:t>
+              <w:t>0.1586</w:t>
             </w:r>
           </w:p>
         </w:tc>
@@ -726,7 +726,7 @@
           </w:tcPr>
           <w:p>
             <w:r>
-              <w:t>0.2798</w:t>
+              <w:t>0.2275</w:t>
             </w:r>
           </w:p>
         </w:tc>
@@ -758,7 +758,7 @@
           </w:tcPr>
           <w:p>
             <w:r>
-              <w:t>23.3526</w:t>
+              <w:t>9.8567</w:t>
             </w:r>
           </w:p>
         </w:tc>
@@ -768,7 +768,7 @@
           </w:tcPr>
           <w:p>
             <w:r>
-              <w:t>40.1525</w:t>
+              <w:t>93.4819</w:t>
             </w:r>
           </w:p>
         </w:tc>
@@ -790,7 +790,7 @@
           </w:tcPr>
           <w:p>
             <w:r>
-              <w:t>0.0142</w:t>
+              <w:t>0.0102</w:t>
             </w:r>
           </w:p>
         </w:tc>
@@ -800,7 +800,7 @@
           </w:tcPr>
           <w:p>
             <w:r>
-              <w:t>108.6556</w:t>
+              <w:t>53.6150</w:t>
             </w:r>
           </w:p>
         </w:tc>
@@ -810,7 +810,7 @@
           </w:tcPr>
           <w:p>
             <w:r>
-              <w:t>110.8701</w:t>
+              <w:t>56.3092</w:t>
             </w:r>
           </w:p>
         </w:tc>
@@ -832,7 +832,7 @@
           </w:tcPr>
           <w:p>
             <w:r>
-              <w:t>0.8923</w:t>
+              <w:t>4.0245</w:t>
             </w:r>
           </w:p>
         </w:tc>
@@ -842,7 +842,7 @@
           </w:tcPr>
           <w:p>
             <w:r>
-              <w:t>541.0423</w:t>
+              <w:t>172.7562</w:t>
             </w:r>
           </w:p>
         </w:tc>
@@ -852,7 +852,7 @@
           </w:tcPr>
           <w:p>
             <w:r>
-              <w:t>671.8124</w:t>
+              <w:t>374.6013</w:t>
             </w:r>
           </w:p>
         </w:tc>
@@ -874,7 +874,7 @@
           </w:tcPr>
           <w:p>
             <w:r>
-              <w:t>100.00</w:t>
+              <w:t>99.29</w:t>
             </w:r>
           </w:p>
         </w:tc>
@@ -1181,7 +1181,7 @@
           </w:tcPr>
           <w:p>
             <w:r>
-              <w:t>0.938</w:t>
+              <w:t>0.963</w:t>
             </w:r>
           </w:p>
         </w:tc>
@@ -1201,7 +1201,7 @@
           </w:tcPr>
           <w:p>
             <w:r>
-              <w:t>29.772</w:t>
+              <w:t>29.796</w:t>
             </w:r>
           </w:p>
         </w:tc>
@@ -1233,7 +1233,7 @@
           </w:tcPr>
           <w:p>
             <w:r>
-              <w:t>1.557</w:t>
+              <w:t>0.692</w:t>
             </w:r>
           </w:p>
         </w:tc>
@@ -1253,7 +1253,7 @@
           </w:tcPr>
           <w:p>
             <w:r>
-              <w:t>20.592</w:t>
+              <w:t>20.638</w:t>
             </w:r>
           </w:p>
         </w:tc>
@@ -1320,7 +1320,7 @@
     </w:p>
     <w:p>
       <w:r>
-        <w:t>本次仅输入组、完整组的完整控制步骤中位数分别为 108.656、110.870 ms。两组中位数均超过 1 ms 采样预算，当前实现未达到该实时要求。</w:t>
+        <w:t>本次仅输入组、完整组的完整控制步骤中位数分别为 53.615、56.309 ms。两组中位数均超过 1 ms 采样预算，当前实现未达到该实时要求。</w:t>
       </w:r>
     </w:p>
     <w:p>
@@ -1335,12 +1335,7 @@
     </w:p>
     <w:p>
       <w:r>
-        <w:t>记录的回归测试数量：10。</w:t>
-      </w:r>
-    </w:p>
-    <w:p>
-      <w:r>
-        <w:t>验证文件包含 50 项具名检查；不将未执行的检查标为通过。</w:t>
+        <w:t>验证文件包含 51 项具名检查；不将未执行的检查标为通过。</w:t>
       </w:r>
     </w:p>
     <w:p>

</xml_diff>